<commit_message>
Document the chronological train/test split (table, figure, notebook section)
Co-Authored-By: Claude Sonnet 5.5 <noreply@anthropic.com>
Claude-Session: https://claude.ai/code/session_01HA7Akax9K4EZgWnnKkJDxp
</commit_message>
<xml_diff>
--- a/report/project_report.docx
+++ b/report/project_report.docx
@@ -2907,7 +2907,7 @@
           <w:b w:val="0"/>
           <w:i w:val="0"/>
         </w:rPr>
-        <w:t>AIC (Akaike, 1974) targets predictive accuracy and BIC (Schwarz, 1978) penalises complexity more heavily for large n. Differences ΔAIC and ΔBIC to the best model and Akaike weights are reported. Information criteria rank models but do not show that the best model fits, so goodness of fit was also tested. Standard Kolmogorov-Smirnov (KS) and Anderson-Darling (AD) critical values are invalid when parameters are estimated from the same data (Lilliefors, 1967), so the null distribution was obtained by a parametric bootstrap with re-estimation in each replicate (B = 200; smallest attainable p = 1/201 = 0.005). The robustness of the ranking was checked by changing the envelope quantile (0.90, 0.98), the daylight threshold (5%, 20%), the envelope window (±15 days), and by using noon values only (n = 365) and every third day, which removes most of the dependence. Residuals were checked with the Ljung-Box test (Ljung and Box, 1978) on residuals and squared residuals, the ARCH-LM test and the Jarque-Bera test. Forecasts use a chronological 75/25 split. The model order is chosen by BIC on the training data only, parameters are then applied with the filter so that each forecast uses data up to the previous hour, and forecasts are scored by RMSE and MAE in index units and MW against persistence baselines. All code is in the project repository (https://github.com/vihaang123/Maximum-likelihood-estimation-renewable-energy); the random seed is fixed in src/config.py. The software used was Python 3.13.16, NumPy 2.5.4, pandas 3.0.6, SciPy 1.18.1, statsmodels 0.15.0 and arch 8.0.0.</w:t>
+        <w:t>AIC (Akaike, 1974) targets predictive accuracy and BIC (Schwarz, 1978) penalises complexity more heavily for large n. Differences ΔAIC and ΔBIC to the best model and Akaike weights are reported. Information criteria rank models but do not show that the best model fits, so goodness of fit was also tested. Standard Kolmogorov-Smirnov (KS) and Anderson-Darling (AD) critical values are invalid when parameters are estimated from the same data (Lilliefors, 1967), so the null distribution was obtained by a parametric bootstrap with re-estimation in each replicate (B = 200; smallest attainable p = 1/201 = 0.005). The robustness of the ranking was checked by changing the envelope quantile (0.90, 0.98), the daylight threshold (5%, 20%), the envelope window (±15 days), and by using noon values only (n = 365) and every third day, which removes most of the dependence. Residuals were checked with the Ljung-Box test (Ljung and Box, 1978) on residuals and squared residuals, the ARCH-LM test and the Jarque-Bera test. Only the forecasting experiment uses held-out data: a chronological 75/25 train/test split of the days (Section 3.5), while the distribution and ARMA/GARCH comparisons use the whole year. The model order is chosen by BIC on the training data only, parameters are then applied with the filter so that each forecast uses data up to the previous hour, and forecasts are scored by RMSE and MAE in index units and MW against persistence baselines. All code is in the project repository (https://github.com/vihaang123/Maximum-likelihood-estimation-renewable-energy); the random seed is fixed in src/config.py. The software used was Python 3.13.16, NumPy 2.5.4, pandas 3.0.6, SciPy 1.18.1, statsmodels 0.15.0 and arch 8.0.0.</w:t>
       </w:r>
     </w:p>
     <w:p>
@@ -10104,10 +10104,17 @@
       </w:pPr>
       <w:r>
         <w:rPr>
+          <w:b/>
+          <w:i w:val="0"/>
+        </w:rPr>
+        <w:t>Where the train/test split is used.</w:t>
+      </w:r>
+      <w:r>
+        <w:rPr>
           <w:b w:val="0"/>
           <w:i w:val="0"/>
         </w:rPr>
-        <w:t>The training sample covers the first 274 days (2,868 daylight observations) and the test sample the last 91 days (758 daylight hours). BIC on the training data selected ARMA(1,1)×(1,0,0)₂₄ without harmonics (Table 10).</w:t>
+        <w:t xml:space="preserve"> A chronological split was used for the forecasting experiment only. The first 75% of days form the training set and the last 25% the hold-out test set; the data are never shuffled, and no test data are used for estimation or order selection. The distribution fits (Sections 3.1 and 3.2) and the ARMA and GARCH model comparisons (Section 3.3) describe the whole year, so they are in-sample comparisons by AIC and BIC; they are not scored on held-out data.</w:t>
       </w:r>
     </w:p>
     <w:p>
@@ -10122,7 +10129,486 @@
           <w:color w:val="1F3864"/>
           <w:sz w:val="19"/>
         </w:rPr>
-        <w:t>Table 10: One-hour-ahead forecast accuracy on the hold-out period (skill = 1 − RMSE / RMSE of index persistence)</w:t>
+        <w:t>Table 10: Chronological train/test split used for forecasting</w:t>
+      </w:r>
+    </w:p>
+    <w:tbl>
+      <w:tblPr>
+        <w:tblW w:type="auto" w:w="0"/>
+        <w:jc w:val="center"/>
+        <w:tblLayout w:type="fixed"/>
+        <w:tblLook w:firstColumn="1" w:firstRow="1" w:lastColumn="0" w:lastRow="0" w:noHBand="0" w:noVBand="1" w:val="04A0"/>
+        <w:tblBorders>
+          <w:top w:val="single" w:sz="4" w:color="BFBFBF"/>
+          <w:left w:val="single" w:sz="4" w:color="BFBFBF"/>
+          <w:bottom w:val="single" w:sz="4" w:color="BFBFBF"/>
+          <w:right w:val="single" w:sz="4" w:color="BFBFBF"/>
+          <w:insideH w:val="single" w:sz="4" w:color="BFBFBF"/>
+          <w:insideV w:val="single" w:sz="4" w:color="BFBFBF"/>
+        </w:tblBorders>
+      </w:tblPr>
+      <w:tblGrid>
+        <w:gridCol w:w="1474"/>
+        <w:gridCol w:w="1191"/>
+        <w:gridCol w:w="1191"/>
+        <w:gridCol w:w="680"/>
+        <w:gridCol w:w="1077"/>
+        <w:gridCol w:w="3458"/>
+      </w:tblGrid>
+      <w:tr>
+        <w:trPr>
+          <w:cantSplit/>
+        </w:trPr>
+        <w:tc>
+          <w:tcPr>
+            <w:tcW w:type="dxa" w:w="1474"/>
+            <w:shd w:val="clear" w:color="auto" w:fill="1F3864"/>
+          </w:tcPr>
+          <w:p>
+            <w:pPr>
+              <w:spacing w:after="0"/>
+              <w:jc w:val="center"/>
+            </w:pPr>
+            <w:r/>
+            <w:r>
+              <w:rPr>
+                <w:b/>
+                <w:color w:val="FFFFFF"/>
+                <w:sz w:val="17"/>
+              </w:rPr>
+              <w:t>Set</w:t>
+            </w:r>
+          </w:p>
+        </w:tc>
+        <w:tc>
+          <w:tcPr>
+            <w:tcW w:type="dxa" w:w="1191"/>
+            <w:shd w:val="clear" w:color="auto" w:fill="1F3864"/>
+          </w:tcPr>
+          <w:p>
+            <w:pPr>
+              <w:spacing w:after="0"/>
+              <w:jc w:val="center"/>
+            </w:pPr>
+            <w:r/>
+            <w:r>
+              <w:rPr>
+                <w:b/>
+                <w:color w:val="FFFFFF"/>
+                <w:sz w:val="17"/>
+              </w:rPr>
+              <w:t>Start</w:t>
+            </w:r>
+          </w:p>
+        </w:tc>
+        <w:tc>
+          <w:tcPr>
+            <w:tcW w:type="dxa" w:w="1191"/>
+            <w:shd w:val="clear" w:color="auto" w:fill="1F3864"/>
+          </w:tcPr>
+          <w:p>
+            <w:pPr>
+              <w:spacing w:after="0"/>
+              <w:jc w:val="center"/>
+            </w:pPr>
+            <w:r/>
+            <w:r>
+              <w:rPr>
+                <w:b/>
+                <w:color w:val="FFFFFF"/>
+                <w:sz w:val="17"/>
+              </w:rPr>
+              <w:t>End</w:t>
+            </w:r>
+          </w:p>
+        </w:tc>
+        <w:tc>
+          <w:tcPr>
+            <w:tcW w:type="dxa" w:w="680"/>
+            <w:shd w:val="clear" w:color="auto" w:fill="1F3864"/>
+          </w:tcPr>
+          <w:p>
+            <w:pPr>
+              <w:spacing w:after="0"/>
+              <w:jc w:val="center"/>
+            </w:pPr>
+            <w:r/>
+            <w:r>
+              <w:rPr>
+                <w:b/>
+                <w:color w:val="FFFFFF"/>
+                <w:sz w:val="17"/>
+              </w:rPr>
+              <w:t>Days</w:t>
+            </w:r>
+          </w:p>
+        </w:tc>
+        <w:tc>
+          <w:tcPr>
+            <w:tcW w:type="dxa" w:w="1077"/>
+            <w:shd w:val="clear" w:color="auto" w:fill="1F3864"/>
+          </w:tcPr>
+          <w:p>
+            <w:pPr>
+              <w:spacing w:after="0"/>
+              <w:jc w:val="center"/>
+            </w:pPr>
+            <w:r/>
+            <w:r>
+              <w:rPr>
+                <w:b/>
+                <w:color w:val="FFFFFF"/>
+                <w:sz w:val="17"/>
+              </w:rPr>
+              <w:t>Daylight hours</w:t>
+            </w:r>
+          </w:p>
+        </w:tc>
+        <w:tc>
+          <w:tcPr>
+            <w:tcW w:type="dxa" w:w="3458"/>
+            <w:shd w:val="clear" w:color="auto" w:fill="1F3864"/>
+          </w:tcPr>
+          <w:p>
+            <w:pPr>
+              <w:spacing w:after="0"/>
+              <w:jc w:val="center"/>
+            </w:pPr>
+            <w:r/>
+            <w:r>
+              <w:rPr>
+                <w:b/>
+                <w:color w:val="FFFFFF"/>
+                <w:sz w:val="17"/>
+              </w:rPr>
+              <w:t>Used for</w:t>
+            </w:r>
+          </w:p>
+        </w:tc>
+      </w:tr>
+      <w:tr>
+        <w:trPr>
+          <w:cantSplit/>
+        </w:trPr>
+        <w:tc>
+          <w:tcPr>
+            <w:tcW w:type="dxa" w:w="1474"/>
+          </w:tcPr>
+          <w:p>
+            <w:pPr>
+              <w:spacing w:after="0" w:line="240" w:lineRule="auto"/>
+              <w:jc w:val="left"/>
+            </w:pPr>
+            <w:r/>
+            <w:r>
+              <w:rPr>
+                <w:b w:val="0"/>
+                <w:sz w:val="17"/>
+              </w:rPr>
+              <w:t>Training</w:t>
+            </w:r>
+          </w:p>
+        </w:tc>
+        <w:tc>
+          <w:tcPr>
+            <w:tcW w:type="dxa" w:w="1191"/>
+          </w:tcPr>
+          <w:p>
+            <w:pPr>
+              <w:spacing w:after="0" w:line="240" w:lineRule="auto"/>
+              <w:jc w:val="center"/>
+            </w:pPr>
+            <w:r/>
+            <w:r>
+              <w:rPr>
+                <w:b w:val="0"/>
+                <w:sz w:val="17"/>
+              </w:rPr>
+              <w:t>2006-01-01</w:t>
+            </w:r>
+          </w:p>
+        </w:tc>
+        <w:tc>
+          <w:tcPr>
+            <w:tcW w:type="dxa" w:w="1191"/>
+          </w:tcPr>
+          <w:p>
+            <w:pPr>
+              <w:spacing w:after="0" w:line="240" w:lineRule="auto"/>
+              <w:jc w:val="center"/>
+            </w:pPr>
+            <w:r/>
+            <w:r>
+              <w:rPr>
+                <w:b w:val="0"/>
+                <w:sz w:val="17"/>
+              </w:rPr>
+              <w:t>2006-10-01</w:t>
+            </w:r>
+          </w:p>
+        </w:tc>
+        <w:tc>
+          <w:tcPr>
+            <w:tcW w:type="dxa" w:w="680"/>
+          </w:tcPr>
+          <w:p>
+            <w:pPr>
+              <w:spacing w:after="0" w:line="240" w:lineRule="auto"/>
+              <w:jc w:val="center"/>
+            </w:pPr>
+            <w:r/>
+            <w:r>
+              <w:rPr>
+                <w:b w:val="0"/>
+                <w:sz w:val="17"/>
+              </w:rPr>
+              <w:t>274</w:t>
+            </w:r>
+          </w:p>
+        </w:tc>
+        <w:tc>
+          <w:tcPr>
+            <w:tcW w:type="dxa" w:w="1077"/>
+          </w:tcPr>
+          <w:p>
+            <w:pPr>
+              <w:spacing w:after="0" w:line="240" w:lineRule="auto"/>
+              <w:jc w:val="center"/>
+            </w:pPr>
+            <w:r/>
+            <w:r>
+              <w:rPr>
+                <w:b w:val="0"/>
+                <w:sz w:val="17"/>
+              </w:rPr>
+              <w:t>2870</w:t>
+            </w:r>
+          </w:p>
+        </w:tc>
+        <w:tc>
+          <w:tcPr>
+            <w:tcW w:type="dxa" w:w="3458"/>
+          </w:tcPr>
+          <w:p>
+            <w:pPr>
+              <w:spacing w:after="0" w:line="240" w:lineRule="auto"/>
+              <w:jc w:val="left"/>
+            </w:pPr>
+            <w:r/>
+            <w:r>
+              <w:rPr>
+                <w:b w:val="0"/>
+                <w:sz w:val="17"/>
+              </w:rPr>
+              <w:t>order selection (BIC) and parameter estimation</w:t>
+            </w:r>
+          </w:p>
+        </w:tc>
+      </w:tr>
+      <w:tr>
+        <w:trPr>
+          <w:cantSplit/>
+        </w:trPr>
+        <w:tc>
+          <w:tcPr>
+            <w:tcW w:type="dxa" w:w="1474"/>
+          </w:tcPr>
+          <w:p>
+            <w:pPr>
+              <w:spacing w:after="0" w:line="240" w:lineRule="auto"/>
+              <w:jc w:val="left"/>
+            </w:pPr>
+            <w:r/>
+            <w:r>
+              <w:rPr>
+                <w:b w:val="0"/>
+                <w:sz w:val="17"/>
+              </w:rPr>
+              <w:t>Test (hold-out)</w:t>
+            </w:r>
+          </w:p>
+        </w:tc>
+        <w:tc>
+          <w:tcPr>
+            <w:tcW w:type="dxa" w:w="1191"/>
+          </w:tcPr>
+          <w:p>
+            <w:pPr>
+              <w:spacing w:after="0" w:line="240" w:lineRule="auto"/>
+              <w:jc w:val="center"/>
+            </w:pPr>
+            <w:r/>
+            <w:r>
+              <w:rPr>
+                <w:b w:val="0"/>
+                <w:sz w:val="17"/>
+              </w:rPr>
+              <w:t>2006-10-02</w:t>
+            </w:r>
+          </w:p>
+        </w:tc>
+        <w:tc>
+          <w:tcPr>
+            <w:tcW w:type="dxa" w:w="1191"/>
+          </w:tcPr>
+          <w:p>
+            <w:pPr>
+              <w:spacing w:after="0" w:line="240" w:lineRule="auto"/>
+              <w:jc w:val="center"/>
+            </w:pPr>
+            <w:r/>
+            <w:r>
+              <w:rPr>
+                <w:b w:val="0"/>
+                <w:sz w:val="17"/>
+              </w:rPr>
+              <w:t>2006-12-31</w:t>
+            </w:r>
+          </w:p>
+        </w:tc>
+        <w:tc>
+          <w:tcPr>
+            <w:tcW w:type="dxa" w:w="680"/>
+          </w:tcPr>
+          <w:p>
+            <w:pPr>
+              <w:spacing w:after="0" w:line="240" w:lineRule="auto"/>
+              <w:jc w:val="center"/>
+            </w:pPr>
+            <w:r/>
+            <w:r>
+              <w:rPr>
+                <w:b w:val="0"/>
+                <w:sz w:val="17"/>
+              </w:rPr>
+              <w:t>91</w:t>
+            </w:r>
+          </w:p>
+        </w:tc>
+        <w:tc>
+          <w:tcPr>
+            <w:tcW w:type="dxa" w:w="1077"/>
+          </w:tcPr>
+          <w:p>
+            <w:pPr>
+              <w:spacing w:after="0" w:line="240" w:lineRule="auto"/>
+              <w:jc w:val="center"/>
+            </w:pPr>
+            <w:r/>
+            <w:r>
+              <w:rPr>
+                <w:b w:val="0"/>
+                <w:sz w:val="17"/>
+              </w:rPr>
+              <w:t>849</w:t>
+            </w:r>
+          </w:p>
+        </w:tc>
+        <w:tc>
+          <w:tcPr>
+            <w:tcW w:type="dxa" w:w="3458"/>
+          </w:tcPr>
+          <w:p>
+            <w:pPr>
+              <w:spacing w:after="0" w:line="240" w:lineRule="auto"/>
+              <w:jc w:val="left"/>
+            </w:pPr>
+            <w:r/>
+            <w:r>
+              <w:rPr>
+                <w:b w:val="0"/>
+                <w:sz w:val="17"/>
+              </w:rPr>
+              <w:t>forecast scoring (758 hours with an observed previous hour)</w:t>
+            </w:r>
+          </w:p>
+        </w:tc>
+      </w:tr>
+    </w:tbl>
+    <w:p>
+      <w:pPr>
+        <w:spacing w:after="40"/>
+      </w:pPr>
+    </w:p>
+    <w:p>
+      <w:pPr>
+        <w:jc w:val="both"/>
+      </w:pPr>
+      <w:r>
+        <w:rPr>
+          <w:b w:val="0"/>
+          <w:i w:val="0"/>
+        </w:rPr>
+        <w:t>Training covers the first 274 days (to 2006-10-01) and testing the last 91 days (from 2006-10-02), so the test period is October to December. The table counts daylight hours with a valid index; the fitted training sample contained 2,868 observations, and 758 test hours were scored (those whose previous hour is also observed). BIC on the training data selected ARMA(1,1)×(1,0,0)₂₄ without harmonics (Table 11).</w:t>
+      </w:r>
+    </w:p>
+    <w:p>
+      <w:pPr>
+        <w:keepNext/>
+        <w:jc w:val="center"/>
+      </w:pPr>
+      <w:r>
+        <w:drawing>
+          <wp:inline xmlns:a="http://schemas.openxmlformats.org/drawingml/2006/main" xmlns:pic="http://schemas.openxmlformats.org/drawingml/2006/picture">
+            <wp:extent cx="5328000" cy="1743709"/>
+            <wp:docPr id="6" name="Picture 6"/>
+            <wp:cNvGraphicFramePr>
+              <a:graphicFrameLocks noChangeAspect="1"/>
+            </wp:cNvGraphicFramePr>
+            <a:graphic>
+              <a:graphicData uri="http://schemas.openxmlformats.org/drawingml/2006/picture">
+                <pic:pic>
+                  <pic:nvPicPr>
+                    <pic:cNvPr id="0" name="fig15_train_test_split.png"/>
+                    <pic:cNvPicPr/>
+                  </pic:nvPicPr>
+                  <pic:blipFill>
+                    <a:blip r:embed="rId15"/>
+                    <a:stretch>
+                      <a:fillRect/>
+                    </a:stretch>
+                  </pic:blipFill>
+                  <pic:spPr>
+                    <a:xfrm>
+                      <a:off x="0" y="0"/>
+                      <a:ext cx="5328000" cy="1743709"/>
+                    </a:xfrm>
+                    <a:prstGeom prst="rect"/>
+                  </pic:spPr>
+                </pic:pic>
+              </a:graphicData>
+            </a:graphic>
+          </wp:inline>
+        </w:drawing>
+      </w:r>
+    </w:p>
+    <w:p>
+      <w:pPr>
+        <w:spacing w:after="160"/>
+        <w:jc w:val="center"/>
+      </w:pPr>
+      <w:r>
+        <w:rPr>
+          <w:i/>
+          <w:color w:val="595959"/>
+          <w:sz w:val="19"/>
+        </w:rPr>
+        <w:t>Figure 6: Chronological train/test split of the clear-sky index (causal-envelope version used for forecasting)</w:t>
+      </w:r>
+    </w:p>
+    <w:p>
+      <w:pPr>
+        <w:keepNext/>
+        <w:spacing w:after="60"/>
+        <w:jc w:val="center"/>
+      </w:pPr>
+      <w:r>
+        <w:rPr>
+          <w:b/>
+          <w:color w:val="1F3864"/>
+          <w:sz w:val="19"/>
+        </w:rPr>
+        <w:t>Table 11: One-hour-ahead forecast accuracy on the hold-out period (skill = 1 − RMSE / RMSE of index persistence)</w:t>
       </w:r>
     </w:p>
     <w:tbl>
@@ -10788,7 +11274,7 @@
         <w:drawing>
           <wp:inline xmlns:a="http://schemas.openxmlformats.org/drawingml/2006/main" xmlns:pic="http://schemas.openxmlformats.org/drawingml/2006/picture">
             <wp:extent cx="5328000" cy="1846376"/>
-            <wp:docPr id="6" name="Picture 6"/>
+            <wp:docPr id="7" name="Picture 7"/>
             <wp:cNvGraphicFramePr>
               <a:graphicFrameLocks noChangeAspect="1"/>
             </wp:cNvGraphicFramePr>
@@ -10800,7 +11286,7 @@
                     <pic:cNvPicPr/>
                   </pic:nvPicPr>
                   <pic:blipFill>
-                    <a:blip r:embed="rId15"/>
+                    <a:blip r:embed="rId16"/>
                     <a:stretch>
                       <a:fillRect/>
                     </a:stretch>
@@ -10830,7 +11316,7 @@
           <w:color w:val="595959"/>
           <w:sz w:val="19"/>
         </w:rPr>
-        <w:t>Figure 6: Forecast evaluation on the hold-out period</w:t>
+        <w:t>Figure 7: Forecast evaluation on the hold-out period</w:t>
       </w:r>
     </w:p>
     <w:p>
@@ -10853,7 +11339,7 @@
           <w:color w:val="1F3864"/>
           <w:sz w:val="19"/>
         </w:rPr>
-        <w:t>Table 11: Overall summary</w:t>
+        <w:t>Table 12: Overall summary</w:t>
       </w:r>
     </w:p>
     <w:tbl>
@@ -11133,6 +11619,49 @@
                 <w:sz w:val="18"/>
               </w:rPr>
               <w:t>All ARMA and GARCH residual tests reject; GARCH fit is degenerate (α + β = 1).</w:t>
+            </w:r>
+          </w:p>
+        </w:tc>
+      </w:tr>
+      <w:tr>
+        <w:trPr>
+          <w:cantSplit/>
+        </w:trPr>
+        <w:tc>
+          <w:tcPr>
+            <w:tcW w:type="dxa" w:w="2154"/>
+          </w:tcPr>
+          <w:p>
+            <w:pPr>
+              <w:spacing w:after="0" w:line="240" w:lineRule="auto"/>
+              <w:jc w:val="left"/>
+            </w:pPr>
+            <w:r/>
+            <w:r>
+              <w:rPr>
+                <w:b w:val="0"/>
+                <w:sz w:val="18"/>
+              </w:rPr>
+              <w:t>Train/test split</w:t>
+            </w:r>
+          </w:p>
+        </w:tc>
+        <w:tc>
+          <w:tcPr>
+            <w:tcW w:type="dxa" w:w="6917"/>
+          </w:tcPr>
+          <w:p>
+            <w:pPr>
+              <w:spacing w:after="0" w:line="240" w:lineRule="auto"/>
+              <w:jc w:val="left"/>
+            </w:pPr>
+            <w:r/>
+            <w:r>
+              <w:rPr>
+                <w:b w:val="0"/>
+                <w:sz w:val="18"/>
+              </w:rPr>
+              <w:t>Chronological 75/25: 274 training days, 91 test days (forecasting only; other comparisons are in-sample).</w:t>
             </w:r>
           </w:p>
         </w:tc>

</xml_diff>